<commit_message>
some tweaks and a fix
fix in rf gabor centers that was lost in previous commit.
Ready for final testing
</commit_message>
<xml_diff>
--- a/Instructions on setting up wrapped visual stimulation.docx
+++ b/Instructions on setting up wrapped visual stimulation.docx
@@ -46,25 +46,7 @@
             <w:sz w:val="11"/>
             <w:szCs w:val="11"/>
           </w:rPr>
-          <w:t>https://brainmapportal-live-4cc80a57cd6e400d854-f7fdcae.divio-media.net</w:t>
-        </w:r>
-        <w:r>
-          <w:rPr>
-            <w:rStyle w:val="Hyperlink"/>
-            <w:rFonts w:ascii="Menlo" w:hAnsi="Menlo" w:cs="Menlo"/>
-            <w:sz w:val="11"/>
-            <w:szCs w:val="11"/>
-          </w:rPr>
-          <w:t>/</w:t>
-        </w:r>
-        <w:r>
-          <w:rPr>
-            <w:rStyle w:val="Hyperlink"/>
-            <w:rFonts w:ascii="Menlo" w:hAnsi="Menlo" w:cs="Menlo"/>
-            <w:sz w:val="11"/>
-            <w:szCs w:val="11"/>
-          </w:rPr>
-          <w:t>filer_public/80/75/8075a100-ca64-429a-b39a-569121b612b2/neuropixels_visual_coding_-_white_paper_v10.pdf</w:t>
+          <w:t>https://brainmapportal-live-4cc80a57cd6e400d854-f7fdcae.divio-media.net/filer_public/80/75/8075a100-ca64-429a-b39a-569121b612b2/neuropixels_visual_coding_-_white_paper_v10.pdf</w:t>
         </w:r>
       </w:hyperlink>
     </w:p>
@@ -201,13 +183,7 @@
         <w:t xml:space="preserve">and comfortably </w:t>
       </w:r>
       <w:r>
-        <w:t>facing you, perform Display Gamma Calibration u</w:t>
-      </w:r>
-      <w:r>
-        <w:t>sing the built-in calibration tool</w:t>
-      </w:r>
-      <w:r>
-        <w:t>.</w:t>
+        <w:t>facing you, perform Display Gamma Calibration using the built-in calibration tool.</w:t>
       </w:r>
     </w:p>
     <w:p>
@@ -215,13 +191,7 @@
         <w:pStyle w:val="ListParagraph"/>
       </w:pPr>
       <w:r>
-        <w:t>To o</w:t>
-      </w:r>
-      <w:r>
-        <w:t>pen the tool: Search for "calibrate display color" in the Windows search bar and select the result to open the tool.</w:t>
-      </w:r>
-      <w:r>
-        <w:t xml:space="preserve"> Follow the instructions to complete the procedure.</w:t>
+        <w:t>To open the tool: Search for "calibrate display color" in the Windows search bar and select the result to open the tool. Follow the instructions to complete the procedure.</w:t>
       </w:r>
       <w:r>
         <w:t xml:space="preserve"> </w:t>
@@ -271,7 +241,16 @@
         <w:t>Open Display Settings and note the identifier assigned to the rig monitor.</w:t>
       </w:r>
       <w:r>
-        <w:t xml:space="preserve"> Update line 26 of the script accordingly (you can open the script with Notepad++, and save it):</w:t>
+        <w:t xml:space="preserve"> Update </w:t>
+      </w:r>
+      <w:r>
+        <w:rPr>
+          <w:u w:val="single"/>
+        </w:rPr>
+        <w:t>line 26</w:t>
+      </w:r>
+      <w:r>
+        <w:t xml:space="preserve"> of the script accordingly (you can open the script with Notepad++, and save it):</w:t>
       </w:r>
     </w:p>
     <w:p>
@@ -337,13 +316,7 @@
         <w:pStyle w:val="code"/>
       </w:pPr>
       <w:r>
-        <w:t xml:space="preserve">conda </w:t>
-      </w:r>
-      <w:r>
-        <w:t>activate</w:t>
-      </w:r>
-      <w:r>
-        <w:t xml:space="preserve"> wvs</w:t>
+        <w:t>conda activate wvs</w:t>
       </w:r>
     </w:p>
     <w:p>
@@ -419,13 +392,7 @@
         <w:t xml:space="preserve">Let the whole stimulus set run (it will take ~1.5 hours). At the end, check </w:t>
       </w:r>
       <w:r>
-        <w:t xml:space="preserve">the whole feedback in </w:t>
-      </w:r>
-      <w:r>
-        <w:t>anaconda prompt</w:t>
-      </w:r>
-      <w:r>
-        <w:t xml:space="preserve"> </w:t>
+        <w:t xml:space="preserve">the whole feedback in anaconda prompt </w:t>
       </w:r>
       <w:r>
         <w:t xml:space="preserve">and annotate </w:t>
@@ -607,48 +574,20 @@
           <w:b/>
           <w:bCs/>
         </w:rPr>
-        <w:t>The n</w:t>
+        <w:t>The number of frames longer than 0.020 second should be fairly low, ideally under 7-8%. The number of frames longer than 0.033 second should be close to zero</w:t>
       </w:r>
       <w:r>
         <w:rPr>
           <w:b/>
           <w:bCs/>
         </w:rPr>
-        <w:t>umber of frames longer than 0.020 second</w:t>
+        <w:t xml:space="preserve"> (under 1%)</w:t>
       </w:r>
       <w:r>
         <w:rPr>
           <w:b/>
           <w:bCs/>
         </w:rPr>
-        <w:t xml:space="preserve"> should be fairly low, ideally under 7-8%. The n</w:t>
-      </w:r>
-      <w:r>
-        <w:rPr>
-          <w:b/>
-          <w:bCs/>
-        </w:rPr>
-        <w:t>umber of frames longer than 0.033 second</w:t>
-      </w:r>
-      <w:r>
-        <w:rPr>
-          <w:b/>
-          <w:bCs/>
-        </w:rPr>
-        <w:t xml:space="preserve"> should be close to zero</w:t>
-      </w:r>
-      <w:r>
-        <w:rPr>
-          <w:b/>
-          <w:bCs/>
-        </w:rPr>
-        <w:t xml:space="preserve"> (under 1%)</w:t>
-      </w:r>
-      <w:r>
-        <w:rPr>
-          <w:b/>
-          <w:bCs/>
-        </w:rPr>
         <w:t xml:space="preserve">. </w:t>
       </w:r>
     </w:p>
@@ -681,7 +620,15 @@
           <w:i/>
           <w:iCs/>
         </w:rPr>
-        <w:t>To do that, we need to change line 35</w:t>
+        <w:t xml:space="preserve">To do that, we need to change </w:t>
+      </w:r>
+      <w:r>
+        <w:rPr>
+          <w:i/>
+          <w:iCs/>
+          <w:u w:val="single"/>
+        </w:rPr>
+        <w:t>line 35</w:t>
       </w:r>
       <w:r>
         <w:rPr>
@@ -856,10 +803,7 @@
         <w:pStyle w:val="code"/>
       </w:pPr>
       <w:r>
-        <w:t>\ASUS_PA248Q_downsampled_5x</w:t>
-      </w:r>
-      <w:r>
-        <w:t xml:space="preserve"> </w:t>
+        <w:t xml:space="preserve">\ASUS_PA248Q_downsampled_5x </w:t>
       </w:r>
     </w:p>
     <w:p>
@@ -957,7 +901,32 @@
         <w:pStyle w:val="ListParagraph"/>
       </w:pPr>
       <w:r>
-        <w:t>Change lines 49 and 55 to True, and then save the script:</w:t>
+        <w:t>Set up trigger and synch lines (software and hardware):</w:t>
+      </w:r>
+    </w:p>
+    <w:p>
+      <w:pPr>
+        <w:pStyle w:val="ListParagraph"/>
+        <w:numPr>
+          <w:ilvl w:val="0"/>
+          <w:numId w:val="0"/>
+        </w:numPr>
+        <w:ind w:left="714"/>
+      </w:pPr>
+      <w:r>
+        <w:t xml:space="preserve">Change lines </w:t>
+      </w:r>
+      <w:r>
+        <w:t>51</w:t>
+      </w:r>
+      <w:r>
+        <w:t xml:space="preserve"> and 5</w:t>
+      </w:r>
+      <w:r>
+        <w:t>6</w:t>
+      </w:r>
+      <w:r>
+        <w:t xml:space="preserve"> to True, and then save the script:</w:t>
       </w:r>
     </w:p>
     <w:p>
@@ -971,7 +940,7 @@
         <w:rPr>
           <w:color w:val="3B3B3B"/>
         </w:rPr>
-        <w:t>49</w:t>
+        <w:t>51</w:t>
       </w:r>
       <w:r>
         <w:tab/>
@@ -1012,12 +981,18 @@
         <w:rPr>
           <w:color w:val="3B3B3B"/>
         </w:rPr>
-        <w:t>55</w:t>
+        <w:t>5</w:t>
       </w:r>
       <w:r>
         <w:rPr>
           <w:color w:val="3B3B3B"/>
         </w:rPr>
+        <w:t>6</w:t>
+      </w:r>
+      <w:r>
+        <w:rPr>
+          <w:color w:val="3B3B3B"/>
+        </w:rPr>
         <w:tab/>
       </w:r>
       <w:r>
@@ -1051,15 +1026,178 @@
       </w:pPr>
     </w:p>
     <w:p>
-      <w:r>
-        <w:t>Connect the Trigger pin in the NIDAQ to the trigger Arduino.</w:t>
-      </w:r>
-    </w:p>
-    <w:p>
-      <w:r>
-        <w:t>Connect the Sync pin out ot the NIDAQ to a channel in your recording system.</w:t>
-      </w:r>
-    </w:p>
+      <w:pPr>
+        <w:ind w:left="720"/>
+      </w:pPr>
+      <w:r>
+        <w:t xml:space="preserve">Connect the </w:t>
+      </w:r>
+      <w:r>
+        <w:rPr>
+          <w:u w:val="single"/>
+        </w:rPr>
+        <w:t xml:space="preserve">Trigger pin </w:t>
+      </w:r>
+      <w:r>
+        <w:rPr>
+          <w:u w:val="single"/>
+        </w:rPr>
+        <w:t xml:space="preserve">(pin 17 in </w:t>
+      </w:r>
+      <w:r>
+        <w:rPr>
+          <w:u w:val="single"/>
+        </w:rPr>
+        <w:t xml:space="preserve">the </w:t>
+      </w:r>
+      <w:r>
+        <w:rPr>
+          <w:u w:val="single"/>
+        </w:rPr>
+        <w:t>image below</w:t>
+      </w:r>
+      <w:r>
+        <w:rPr>
+          <w:u w:val="single"/>
+        </w:rPr>
+        <w:t>, the right-most one</w:t>
+      </w:r>
+      <w:r>
+        <w:rPr>
+          <w:u w:val="single"/>
+        </w:rPr>
+        <w:t xml:space="preserve">) </w:t>
+      </w:r>
+      <w:r>
+        <w:rPr>
+          <w:u w:val="single"/>
+        </w:rPr>
+        <w:t>in the NIDAQ</w:t>
+      </w:r>
+      <w:r>
+        <w:t xml:space="preserve"> to the trigger Arduino</w:t>
+      </w:r>
+      <w:r>
+        <w:t xml:space="preserve"> (you need to set it up, any HIGH signal would work. The script only takes one trigger to start the whole stimulus sequence).</w:t>
+      </w:r>
+    </w:p>
+    <w:p>
+      <w:pPr>
+        <w:ind w:left="720"/>
+      </w:pPr>
+      <w:r>
+        <w:t xml:space="preserve">Connect the </w:t>
+      </w:r>
+      <w:r>
+        <w:rPr>
+          <w:u w:val="single"/>
+        </w:rPr>
+        <w:t>Sync pin out o</w:t>
+      </w:r>
+      <w:r>
+        <w:rPr>
+          <w:u w:val="single"/>
+        </w:rPr>
+        <w:t>f</w:t>
+      </w:r>
+      <w:r>
+        <w:rPr>
+          <w:u w:val="single"/>
+        </w:rPr>
+        <w:t xml:space="preserve"> the NIDAQ</w:t>
+      </w:r>
+      <w:r>
+        <w:rPr>
+          <w:u w:val="single"/>
+        </w:rPr>
+        <w:t xml:space="preserve"> (pin 18 in the image below)</w:t>
+      </w:r>
+      <w:r>
+        <w:t xml:space="preserve"> to a channel in your recording system.</w:t>
+      </w:r>
+    </w:p>
+    <w:p>
+      <w:pPr>
+        <w:ind w:left="720"/>
+      </w:pPr>
+      <w:r>
+        <w:lastRenderedPageBreak/>
+        <w:t xml:space="preserve">NOTE: In the image below, pin 32 (the left-most one) is ground: both </w:t>
+      </w:r>
+      <w:r>
+        <w:t xml:space="preserve">the </w:t>
+      </w:r>
+      <w:r>
+        <w:t>BNCs entering pin 17 and 18 need to be connected to it</w:t>
+      </w:r>
+      <w:r>
+        <w:t xml:space="preserve"> (ideally in a more stable way than the current temporary arrangement)</w:t>
+      </w:r>
+      <w:r>
+        <w:t xml:space="preserve">. </w:t>
+      </w:r>
+    </w:p>
+    <w:p/>
+    <w:p>
+      <w:r>
+        <w:drawing>
+          <wp:anchor distT="0" distB="0" distL="114300" distR="114300" simplePos="0" relativeHeight="251658240" behindDoc="0" locked="0" layoutInCell="1" allowOverlap="1" wp14:anchorId="38D9F679" wp14:editId="526AD05E">
+            <wp:simplePos x="0" y="0"/>
+            <wp:positionH relativeFrom="column">
+              <wp:align>right</wp:align>
+            </wp:positionH>
+            <wp:positionV relativeFrom="paragraph">
+              <wp:posOffset>0</wp:posOffset>
+            </wp:positionV>
+            <wp:extent cx="5256000" cy="5684400"/>
+            <wp:effectExtent l="0" t="0" r="1905" b="5715"/>
+            <wp:wrapTopAndBottom/>
+            <wp:docPr id="879449981" name="Picture 1" descr="A white electronic device with black wires&#10;&#10;AI-generated content may be incorrect."/>
+            <wp:cNvGraphicFramePr>
+              <a:graphicFrameLocks xmlns:a="http://schemas.openxmlformats.org/drawingml/2006/main" noChangeAspect="1"/>
+            </wp:cNvGraphicFramePr>
+            <a:graphic xmlns:a="http://schemas.openxmlformats.org/drawingml/2006/main">
+              <a:graphicData uri="http://schemas.openxmlformats.org/drawingml/2006/picture">
+                <pic:pic xmlns:pic="http://schemas.openxmlformats.org/drawingml/2006/picture">
+                  <pic:nvPicPr>
+                    <pic:cNvPr id="879449981" name="Picture 1" descr="A white electronic device with black wires&#10;&#10;AI-generated content may be incorrect."/>
+                    <pic:cNvPicPr/>
+                  </pic:nvPicPr>
+                  <pic:blipFill>
+                    <a:blip r:embed="rId10">
+                      <a:extLst>
+                        <a:ext uri="{28A0092B-C50C-407E-A947-70E740481C1C}">
+                          <a14:useLocalDpi xmlns:a14="http://schemas.microsoft.com/office/drawing/2010/main" val="0"/>
+                        </a:ext>
+                      </a:extLst>
+                    </a:blip>
+                    <a:stretch>
+                      <a:fillRect/>
+                    </a:stretch>
+                  </pic:blipFill>
+                  <pic:spPr>
+                    <a:xfrm>
+                      <a:off x="0" y="0"/>
+                      <a:ext cx="5256000" cy="5684400"/>
+                    </a:xfrm>
+                    <a:prstGeom prst="rect">
+                      <a:avLst/>
+                    </a:prstGeom>
+                  </pic:spPr>
+                </pic:pic>
+              </a:graphicData>
+            </a:graphic>
+            <wp14:sizeRelH relativeFrom="margin">
+              <wp14:pctWidth>0</wp14:pctWidth>
+            </wp14:sizeRelH>
+            <wp14:sizeRelV relativeFrom="margin">
+              <wp14:pctHeight>0</wp14:pctHeight>
+            </wp14:sizeRelV>
+          </wp:anchor>
+        </w:drawing>
+      </w:r>
+    </w:p>
+    <w:p/>
     <w:p>
       <w:pPr>
         <w:rPr>
@@ -1086,11 +1224,7 @@
         <w:pStyle w:val="Heading2"/>
       </w:pPr>
       <w:r>
-        <w:lastRenderedPageBreak/>
         <w:t>Starting an experiment</w:t>
-      </w:r>
-      <w:r>
-        <w:t>.</w:t>
       </w:r>
     </w:p>
     <w:p>
@@ -1108,6 +1242,7 @@
         <w:keepLines/>
       </w:pPr>
       <w:r>
+        <w:lastRenderedPageBreak/>
         <w:t>conda activate wvs</w:t>
       </w:r>
     </w:p>
@@ -1155,6 +1290,32 @@
         <w:t>recording is ON, start the trigger.</w:t>
       </w:r>
     </w:p>
+    <w:p>
+      <w:pPr>
+        <w:pStyle w:val="Heading2"/>
+      </w:pPr>
+      <w:r>
+        <w:t>St</w:t>
+      </w:r>
+      <w:r>
+        <w:t>oring important experiment metadata</w:t>
+      </w:r>
+    </w:p>
+    <w:p>
+      <w:r>
+        <w:t>At the end of an</w:t>
+      </w:r>
+      <w:r>
+        <w:t xml:space="preserve"> experiment, </w:t>
+      </w:r>
+      <w:r>
+        <w:t xml:space="preserve">back-up the corresponding metadata file .pkl saved in </w:t>
+      </w:r>
+      <w:r>
+        <w:t>C:\data\visual_display_log\visual_display_log</w:t>
+      </w:r>
+    </w:p>
+    <w:p/>
     <w:sectPr>
       <w:pgSz w:w="11906" w:h="16838"/>
       <w:pgMar w:top="1440" w:right="1440" w:bottom="1440" w:left="1440" w:header="708" w:footer="708" w:gutter="0"/>
@@ -2170,6 +2331,7 @@
   <w:style w:type="character" w:default="1" w:styleId="DefaultParagraphFont">
     <w:name w:val="Default Paragraph Font"/>
     <w:uiPriority w:val="1"/>
+    <w:semiHidden/>
     <w:unhideWhenUsed/>
   </w:style>
   <w:style w:type="table" w:default="1" w:styleId="TableNormal">

</xml_diff>